<commit_message>
Vocabulaire des essais harmonise : essais de developpement (S1 a S9) et essais de reglage (E1 a E4)
Co-Authored-By: Claude Opus 5.5 <noreply@anthropic.com>
Claude-Session: https://claude.ai/code/session_01MvWM2RsXLqs8AZ6tPg6HLB
</commit_message>
<xml_diff>
--- a/REDACTION/chapitre4/Chapitre4_Conception_de_l_ELM_PID.docx
+++ b/REDACTION/chapitre4/Chapitre4_Conception_de_l_ELM_PID.docx
@@ -4141,7 +4141,7 @@
         <w:t xml:space="preserve">ε</w:t>
       </w:r>
       <w:r>
-        <w:t xml:space="preserve"> = 10⁻³, zones mortes de 0,1 V, multiplicateurs dans [1/4 ; 4]. Les essais de mise au point E1 à E4, distincts des onze essais de développement, ont servi à contrôler le code et n'ont conduit à changer aucun réglage.</w:t>
+        <w:t xml:space="preserve"> = 10⁻³, zones mortes de 0,1 V, multiplicateurs dans [1/4 ; 4]. Pour l'ELM-PID, les essais de réglage E1 à E4, distincts des onze essais de développement, ont seulement servi à contrôler le code : ils n'ont conduit à changer aucune valeur.</w:t>
       </w:r>
     </w:p>
     <w:p>
@@ -5377,7 +5377,7 @@
         <w:t xml:space="preserve">x</w:t>
       </w:r>
       <w:r>
-        <w:t xml:space="preserve">|² décide seul en régime et ramène les gains au coin (1 ; 0,25 ; 1) de la boîte. Elle porte sur l'erreur efficace, et non sur la moyenne, parce que le coût (4.10) est quadratique ; le seuil et les références sont ceux de l'ELM-PID. Cette zone morte a été choisie après un premier calcul sans elle (indice global de 0,893 sur les onze essais), parmi trois corrections candidates testées sur les seuls essais de mise au point E1 à E4 ; la règle de choix était écrite avant, mais la valeur de cette correction sur les onze essais était déjà connue par une ablation du premier calcul. L'historique complet est sur le dépôt.</w:t>
+        <w:t xml:space="preserve">|² décide seul en régime et ramène les gains au coin (1 ; 0,25 ; 1) de la boîte. Elle porte sur l'erreur efficace, et non sur la moyenne, parce que le coût (4.10) est quadratique ; le seuil et les références sont ceux de l'ELM-PID. Cette zone morte a été choisie après un premier calcul sans elle (indice global de 0,893 sur les onze essais), parmi trois corrections candidates testées sur les seuls essais de réglage E1 à E4 ; la règle de choix était écrite avant, mais la valeur de cette correction sur les onze essais était déjà connue par une ablation du premier calcul. L'historique complet est sur le dépôt.</w:t>
       </w:r>
     </w:p>
     <w:p>

</xml_diff>

<commit_message>
Chapitre 3 (modelisation et base commune) ; figure, bloc PID et validation deplaces du chapitre 5 ; renvois precis
Co-Authored-By: Claude Opus 5.5 <noreply@anthropic.com>
Claude-Session: https://claude.ai/code/session_01MvWM2RsXLqs8AZ6tPg6HLB
</commit_message>
<xml_diff>
--- a/REDACTION/chapitre4/Chapitre4_Conception_de_l_ELM_PID.docx
+++ b/REDACTION/chapitre4/Chapitre4_Conception_de_l_ELM_PID.docx
@@ -20,12 +20,12 @@
     </w:p>
     <w:p>
       <w:r>
-        <w:t xml:space="preserve">L'ELM-PID de ce travail reprend la méthode de [Lu et al., 2021] : un réseau ELM identifie le convertisseur, et son jacobien guide l'ajustement en ligne des gains d'un PID (figure 4.1). Nous l'avons adaptée au convertisseur dimensionné au chapitre 3 et à une comparaison équitable avec quatre autres régulateurs ; chaque modification s'appuie sur une référence ou sur un calcul publié sur le dépôt du travail.</w:t>
-      </w:r>
-    </w:p>
-    <w:p>
-      <w:r>
-        <w:t xml:space="preserve">La section 4.2 justifie le remplacement du PID incrémental de l'article par le bloc PID commun aux cinq méthodes. Les sections 4.3 et 4.4 décrivent le réseau ELM et la loi d'adaptation des gains, la section 4.5 la mise en œuvre sous Simulink. La section 4.6 présente la mise en œuvre des trois méthodes de comparaison. Les gains de Ziegler-Nichols (ZN), point de départ commun, ont été calculés au chapitre 3.</w:t>
+        <w:t xml:space="preserve">L'ELM-PID de ce travail reprend la méthode de [Lu et al., 2021] : un réseau ELM identifie le convertisseur, et son jacobien guide l'ajustement en ligne des gains d'un PID (figure 4.1). Nous l'avons adaptée au convertisseur dimensionné au chapitre 3 (section 3.2) et à une comparaison équitable avec quatre autres régulateurs ; chaque modification s'appuie sur une référence ou sur un calcul publié sur le dépôt du travail.</w:t>
+      </w:r>
+    </w:p>
+    <w:p>
+      <w:r>
+        <w:t xml:space="preserve">La section 4.2 justifie le remplacement du PID incrémental de l'article par le bloc PID commun aux cinq méthodes. Les sections 4.3 et 4.4 décrivent le réseau ELM et la loi d'adaptation des gains, la section 4.5 la mise en œuvre sous Simulink. La section 4.6 présente la mise en œuvre des trois méthodes de comparaison. Les gains de Ziegler-Nichols (ZN), point de départ commun, ont été calculés à la section 3.4.2.</w:t>
       </w:r>
     </w:p>
     <w:p>
@@ -362,7 +362,7 @@
         <w:t xml:space="preserve">K</w:t>
       </w:r>
       <w:r>
-        <w:t xml:space="preserve">d les gains de la forme incrémentale. Nous l'appelons « loi incrémentale de Lu ». Elle s'écarte déjà de l'article sur deux points : la commande est bornée dans la loi, alors que chez Lu c'est le modulateur qui borne, et les gains partent de ceux de Ziegler-Nichols au lieu de zéro.</w:t>
+        <w:t xml:space="preserve">d les gains de la forme incrémentale. Nous l'appelons « loi incrémentale de Lu ». Elle s'écarte déjà de l'article sur deux points : la commande est bornée dans la loi, alors que chez Lu c'est le modulateur qui borne, et les gains partent de ceux de Ziegler-Nichols au lieu de zéro.</w:t>
       </w:r>
     </w:p>
     <w:p>
@@ -375,7 +375,7 @@
     </w:p>
     <w:p>
       <w:r>
-        <w:t xml:space="preserve">La loi (4.1) n'est pas le bloc PID parallèle (5.1) des quatre autres méthodes. Un écart de résultat pouvait donc venir de la loi autant que de l'adaptation. Un diagnostic du 8 octobre 2026 l'a mesuré : avec les mêmes gains fixes (ceux du PSO-PID), la loi incrémentale donne après 30 ms une IAE de 23,50 mV·s contre 16,54 pour le bloc parallèle sur l'essai de charge S4, 7,53 contre 5,46 sur S3 et 6,56 contre 2,04 sur S2. Elle fait mieux au démarrage.</w:t>
+        <w:t xml:space="preserve">La loi (4.1) n'est pas le bloc PID parallèle (3.4) des quatre autres méthodes. Un écart de résultat pouvait donc venir de la loi autant que de l'adaptation. Un diagnostic du 8 octobre 2026 l'a mesuré : avec les mêmes gains fixes (ceux du PSO-PID), la loi incrémentale donne après 30 ms une IAE de 23,50 mV·s contre 16,54 pour le bloc parallèle sur l'essai de charge S4, 7,53 contre 5,46 sur S3 et 6,56 contre 2,04 sur S2. Elle fait mieux au démarrage.</w:t>
       </w:r>
     </w:p>
     <w:p>
@@ -428,7 +428,7 @@
     </w:p>
     <w:p>
       <w:r>
-        <w:t xml:space="preserve">Les essais de la comparaison ont été fixés avant le calcul : S4 pour juger, avec l'indice global de la section 5.2.3 séparé en une part « après 30 ms » et une part « démarrage » ; S2 et S1 pour montrer les deux mécanismes, quel que soit leur résultat. Trois prévisions étaient écrites : pour l'option B, une part après 30 ms inférieure à 0,747 (valeur de la loi incrémentale), une part de démarrage d'au moins 0,90, et une IAE sur S2 au plus égale à celle de Ziegler-Nichols. Le tableau 4.1 donne les résultats.</w:t>
+        <w:t xml:space="preserve">Les essais de la comparaison ont été fixés avant le calcul : S4 pour juger, avec l'indice global de la section 5.2.3 séparé en une part « après 30 ms » et une part « démarrage » ; S2 et S1 pour montrer les deux mécanismes, quel que soit leur résultat. Trois prévisions étaient écrites : pour l'option B, une part après 30 ms inférieure à 0,747 (valeur de la loi incrémentale), une part de démarrage d'au moins 0,90, et une IAE sur S2 au plus égale à celle de Ziegler-Nichols. Le tableau 4.1 donne les résultats.</w:t>
       </w:r>
     </w:p>
     <w:p>
@@ -2158,7 +2158,7 @@
         <w:t xml:space="preserve">C</w:t>
       </w:r>
       <w:r>
-        <w:t xml:space="preserve"> = 0,1 a été retenue (11 tirages sur 20 passent) et son tirage de graine 1 exporté. Le choix est fragile : avec les enregistrements à charge légère refaits, 8 tirages sur 20 seulement passent, et la règle « plus de la moitié » ne l'admettrait plus. Le tirage exporté passe toujours les deux critères et a été gardé. Le script d'apprentissage et de contrôle tourne en 14,8 s.</w:t>
+        <w:t xml:space="preserve"> = 0,1 a été retenue (11 tirages sur 20 passent) et son tirage de graine 1 exporté. Le choix est fragile : avec les enregistrements à charge légère refaits, 8 tirages sur 20 seulement passent, et la règle « plus de la moitié » ne l'admettrait plus. Le tirage exporté passe toujours les deux critères et a été gardé. Le script d'apprentissage et de contrôle tourne en 14,8 s.</w:t>
       </w:r>
     </w:p>
     <w:p>
@@ -2976,7 +2976,7 @@
         <w:t xml:space="preserve">x</w:t>
       </w:r>
       <w:r>
-        <w:t xml:space="preserve"> = (1, 1, 1), l'ELM-PID est exactement le PID de Ziegler-Nichols. La sensibilité de la commande aux gains est la dérivée exacte de la loi (5.1), prise depuis le début de la fenêtre :</w:t>
+        <w:t xml:space="preserve"> = (1, 1, 1), l'ELM-PID est exactement le PID de Ziegler-Nichols. La sensibilité de la commande aux gains est la dérivée exacte de la loi (3.4), prise depuis le début de la fenêtre :</w:t>
       </w:r>
     </w:p>
     <w:p>
@@ -4141,7 +4141,7 @@
         <w:t xml:space="preserve">ε</w:t>
       </w:r>
       <w:r>
-        <w:t xml:space="preserve"> = 10⁻³, zones mortes de 0,1 V, multiplicateurs dans [1/4 ; 4]. Pour l'ELM-PID, les essais de réglage E1 à E4, distincts des onze essais de développement, ont seulement servi à contrôler le code : ils n'ont conduit à changer aucune valeur.</w:t>
+        <w:t xml:space="preserve"> = 10⁻³, zones mortes de 0,1 V, multiplicateurs dans [1/4 ; 4]. Pour l'ELM-PID, les essais de réglage E1 à E4 (section 3.6.2), distincts des onze essais de développement, ont seulement servi à contrôler le code : ils n'ont conduit à changer aucune valeur.</w:t>
       </w:r>
     </w:p>
     <w:p>
@@ -4255,7 +4255,7 @@
         <w:t xml:space="preserve">D</w:t>
       </w:r>
       <w:r>
-        <w:t xml:space="preserve">] vers le bloc « PID Controller » du modèle commun, passé en gains externes. Sa sortie ne dépend que de son état : au pas </w:t>
+        <w:t xml:space="preserve">] vers le bloc « PID Controller » du modèle commun, passé en gains externes. Sa sortie ne dépend que de son état : au pas </w:t>
       </w:r>
       <w:r>
         <w:rPr>
@@ -4971,7 +4971,7 @@
         <w:t xml:space="preserve">T</w:t>
       </w:r>
       <w:r>
-        <w:t xml:space="preserve">u étant la période critique. La méthode est appliquée telle que publiée, avec quatre écarts. Le chapitre 3 ayant écarté la méthode du point critique, on prend le </w:t>
+        <w:t xml:space="preserve">u étant la période critique. La méthode est appliquée telle que publiée, avec quatre écarts. La méthode du point critique ayant été écartée (section 3.4.2), on prend le </w:t>
       </w:r>
       <w:r>
         <w:rPr>

</xml_diff>